<commit_message>
feat: add new RAS team members, update activity cards with links, and refine team tab styling
</commit_message>
<xml_diff>
--- a/LinkedIn-Links-for-the-IEEEWebsite.docx
+++ b/LinkedIn-Links-for-the-IEEEWebsite.docx
@@ -1245,6 +1245,131 @@
         </w:rPr>
         <w:t xml:space="preserve"> – </w:t>
       </w:r>
+      <w:hyperlink r:id="rId27" w:history="1">
+        <w:r>
+          <w:rPr>
+            <w:rStyle w:val="Kpr"/>
+            <w:rFonts w:ascii="Segoe UI" w:hAnsi="Segoe UI" w:cs="Segoe UI"/>
+            <w:sz w:val="21"/>
+            <w:szCs w:val="21"/>
+            <w:shd w:val="clear" w:color="auto" w:fill="FFFFFF"/>
+          </w:rPr>
+          <w:t>https://www.linkedin.com/in/dilasude-%C3%B6zdo%C4%9Fan-b11b303b1/</w:t>
+        </w:r>
+      </w:hyperlink>
+    </w:p>
+    <w:p>
+      <w:pPr>
+        <w:rPr>
+          <w:rFonts w:ascii="Segoe UI" w:hAnsi="Segoe UI" w:cs="Segoe UI"/>
+          <w:sz w:val="21"/>
+          <w:szCs w:val="21"/>
+          <w:shd w:val="clear" w:color="auto" w:fill="FFFFFF"/>
+        </w:rPr>
+      </w:pPr>
+      <w:r>
+        <w:rPr>
+          <w:rFonts w:ascii="Segoe UI" w:hAnsi="Segoe UI" w:cs="Segoe UI"/>
+          <w:sz w:val="21"/>
+          <w:szCs w:val="21"/>
+          <w:shd w:val="clear" w:color="auto" w:fill="FFFFFF"/>
+        </w:rPr>
+        <w:t xml:space="preserve">Furkan Aldemir: </w:t>
+      </w:r>
+      <w:hyperlink r:id="rId28" w:history="1">
+        <w:r>
+          <w:rPr>
+            <w:rStyle w:val="Kpr"/>
+            <w:rFonts w:ascii="Segoe UI" w:hAnsi="Segoe UI" w:cs="Segoe UI"/>
+            <w:sz w:val="21"/>
+            <w:szCs w:val="21"/>
+            <w:shd w:val="clear" w:color="auto" w:fill="FFFFFF"/>
+          </w:rPr>
+          <w:t>https://www.linkedin.com/in/furkan-aldemir-a07907302/</w:t>
+        </w:r>
+      </w:hyperlink>
+    </w:p>
+    <w:p>
+      <w:pPr>
+        <w:rPr>
+          <w:rFonts w:ascii="Segoe UI" w:hAnsi="Segoe UI" w:cs="Segoe UI"/>
+          <w:sz w:val="21"/>
+          <w:szCs w:val="21"/>
+          <w:shd w:val="clear" w:color="auto" w:fill="FFFFFF"/>
+        </w:rPr>
+      </w:pPr>
+      <w:r>
+        <w:rPr>
+          <w:rFonts w:ascii="Segoe UI" w:hAnsi="Segoe UI" w:cs="Segoe UI"/>
+          <w:sz w:val="21"/>
+          <w:szCs w:val="21"/>
+          <w:shd w:val="clear" w:color="auto" w:fill="FFFFFF"/>
+        </w:rPr>
+        <w:t xml:space="preserve">Batuhan Mert Korkmaz: </w:t>
+      </w:r>
+      <w:hyperlink r:id="rId29" w:history="1">
+        <w:r>
+          <w:rPr>
+            <w:rStyle w:val="Kpr"/>
+            <w:rFonts w:ascii="Segoe UI" w:hAnsi="Segoe UI" w:cs="Segoe UI"/>
+            <w:sz w:val="21"/>
+            <w:szCs w:val="21"/>
+            <w:shd w:val="clear" w:color="auto" w:fill="FFFFFF"/>
+          </w:rPr>
+          <w:t>https://www.linkedin.com/in/batuhanmertkorkmaz/</w:t>
+        </w:r>
+      </w:hyperlink>
+    </w:p>
+    <w:p>
+      <w:pPr>
+        <w:rPr>
+          <w:rFonts w:ascii="Segoe UI" w:hAnsi="Segoe UI" w:cs="Segoe UI"/>
+          <w:sz w:val="21"/>
+          <w:szCs w:val="21"/>
+          <w:shd w:val="clear" w:color="auto" w:fill="FFFFFF"/>
+        </w:rPr>
+      </w:pPr>
+      <w:r>
+        <w:rPr>
+          <w:rFonts w:ascii="Segoe UI" w:hAnsi="Segoe UI" w:cs="Segoe UI"/>
+          <w:sz w:val="21"/>
+          <w:szCs w:val="21"/>
+          <w:shd w:val="clear" w:color="auto" w:fill="FFFFFF"/>
+        </w:rPr>
+        <w:t xml:space="preserve">Selin </w:t>
+      </w:r>
+      <w:proofErr w:type="spellStart"/>
+      <w:r>
+        <w:rPr>
+          <w:rFonts w:ascii="Segoe UI" w:hAnsi="Segoe UI" w:cs="Segoe UI"/>
+          <w:sz w:val="21"/>
+          <w:szCs w:val="21"/>
+          <w:shd w:val="clear" w:color="auto" w:fill="FFFFFF"/>
+        </w:rPr>
+        <w:t>Mafizer</w:t>
+      </w:r>
+      <w:proofErr w:type="spellEnd"/>
+      <w:r>
+        <w:rPr>
+          <w:rFonts w:ascii="Segoe UI" w:hAnsi="Segoe UI" w:cs="Segoe UI"/>
+          <w:sz w:val="21"/>
+          <w:szCs w:val="21"/>
+          <w:shd w:val="clear" w:color="auto" w:fill="FFFFFF"/>
+        </w:rPr>
+        <w:t xml:space="preserve">: </w:t>
+      </w:r>
+      <w:hyperlink r:id="rId30" w:history="1">
+        <w:r>
+          <w:rPr>
+            <w:rStyle w:val="Kpr"/>
+            <w:rFonts w:ascii="Segoe UI" w:hAnsi="Segoe UI" w:cs="Segoe UI"/>
+            <w:sz w:val="21"/>
+            <w:szCs w:val="21"/>
+            <w:shd w:val="clear" w:color="auto" w:fill="FFFFFF"/>
+          </w:rPr>
+          <w:t>https://www.linkedin.com/in/selin-mafizer-691b33291/</w:t>
+        </w:r>
+      </w:hyperlink>
     </w:p>
     <w:p/>
     <w:sectPr>

</xml_diff>